<commit_message>
Add threats CSV & diagram; docs and minor fixes
Add a generated threats CSV and replace diagram assets; update docs and small code tweaks.

- Add Upgrade/threats_2_dfd_level_1_2026-04-29.csv with threat entries.
- Replace Diagrams/PlagiarismAI_Threat_Model.png with Diagrams/drawio.png.
- Update .gitignore to include threat_model_extracted.txt, PlagiarismAI_Final_Security_Audit.txt, and Post_Upgrade/.
- Extend README with a Mermaid logical data model (ER diagram) section.
- Update PlagiarismAI_Threat_Modeling_Report.docx (binary change).
- Minor frontend formatting changes in App.jsx and UploadSection.jsx (alert string formatting/trailing commas).
- backend/services/citation.py: an extra duplicate "return False, \"\"" line was added (likely accidental).
</commit_message>
<xml_diff>
--- a/PlagiarismAI_Threat_Modeling_Report.docx
+++ b/PlagiarismAI_Threat_Modeling_Report.docx
@@ -84,38 +84,97 @@
       <w:pPr>
         <w:spacing w:before="600" w:after="60"/>
         <w:jc w:val="center"/>
-      </w:pPr>
-      <w:r>
-        <w:t>Prepared by: Senior Cybersecurity Engineering Team</w:t>
+        <w:rPr>
+          <w:sz w:val="24"/>
+          <w:szCs w:val="24"/>
+        </w:rPr>
+      </w:pPr>
+      <w:r>
+        <w:t xml:space="preserve">Prepared by: </w:t>
+      </w:r>
+      <w:r>
+        <w:br/>
+      </w:r>
+      <w:r>
+        <w:rPr>
+          <w:sz w:val="24"/>
+          <w:szCs w:val="24"/>
+        </w:rPr>
+        <w:t>Muhammad Ayaan Irfan 23K-2084</w:t>
+      </w:r>
+      <w:r>
+        <w:rPr>
+          <w:sz w:val="24"/>
+          <w:szCs w:val="24"/>
+        </w:rPr>
+        <w:br/>
+        <w:t>Zamil Ali 23K-2048</w:t>
+      </w:r>
+      <w:r>
+        <w:rPr>
+          <w:sz w:val="24"/>
+          <w:szCs w:val="24"/>
+        </w:rPr>
+        <w:br/>
+        <w:t>Muneeb Ahmed 23K-2082</w:t>
       </w:r>
     </w:p>
     <w:p>
       <w:pPr>
         <w:spacing w:before="40" w:after="40"/>
         <w:jc w:val="center"/>
-      </w:pPr>
-      <w:r>
         <w:rPr>
           <w:color w:val="C00000"/>
-        </w:rPr>
-        <w:t>Classification: Confidential — Academic Submission</w:t>
-      </w:r>
+          <w:sz w:val="24"/>
+          <w:szCs w:val="24"/>
+        </w:rPr>
+      </w:pPr>
     </w:p>
     <w:p>
       <w:pPr>
         <w:spacing w:before="40" w:after="40"/>
         <w:jc w:val="center"/>
-      </w:pPr>
-      <w:r>
-        <w:t>Date: April 2026</w:t>
+        <w:rPr>
+          <w:sz w:val="24"/>
+          <w:szCs w:val="24"/>
+        </w:rPr>
+      </w:pPr>
+      <w:r>
+        <w:rPr>
+          <w:sz w:val="24"/>
+          <w:szCs w:val="24"/>
+        </w:rPr>
+        <w:t xml:space="preserve">Date: </w:t>
+      </w:r>
+      <w:r>
+        <w:rPr>
+          <w:sz w:val="24"/>
+          <w:szCs w:val="24"/>
+        </w:rPr>
+        <w:t xml:space="preserve">29 </w:t>
+      </w:r>
+      <w:r>
+        <w:rPr>
+          <w:sz w:val="24"/>
+          <w:szCs w:val="24"/>
+        </w:rPr>
+        <w:t>April 2026</w:t>
       </w:r>
     </w:p>
     <w:p>
       <w:pPr>
         <w:spacing w:before="40" w:after="40"/>
         <w:jc w:val="center"/>
-      </w:pPr>
-      <w:r>
+        <w:rPr>
+          <w:sz w:val="24"/>
+          <w:szCs w:val="24"/>
+        </w:rPr>
+      </w:pPr>
+      <w:r>
+        <w:rPr>
+          <w:sz w:val="24"/>
+          <w:szCs w:val="24"/>
+        </w:rPr>
         <w:t>Version: 1.0</w:t>
       </w:r>
     </w:p>
@@ -1992,6 +2051,53 @@
     </w:p>
     <w:p>
       <w:r>
+        <w:rPr>
+          <w:noProof/>
+        </w:rPr>
+        <w:lastRenderedPageBreak/>
+        <w:drawing>
+          <wp:inline distT="0" distB="0" distL="0" distR="0" wp14:anchorId="108EA6FA" wp14:editId="48691202">
+            <wp:extent cx="5943600" cy="5943600"/>
+            <wp:effectExtent l="0" t="0" r="0" b="0"/>
+            <wp:docPr id="484742623" name="Picture 1"/>
+            <wp:cNvGraphicFramePr>
+              <a:graphicFrameLocks xmlns:a="http://schemas.openxmlformats.org/drawingml/2006/main" noChangeAspect="1"/>
+            </wp:cNvGraphicFramePr>
+            <a:graphic xmlns:a="http://schemas.openxmlformats.org/drawingml/2006/main">
+              <a:graphicData uri="http://schemas.openxmlformats.org/drawingml/2006/picture">
+                <pic:pic xmlns:pic="http://schemas.openxmlformats.org/drawingml/2006/picture">
+                  <pic:nvPicPr>
+                    <pic:cNvPr id="484742623" name="Picture 484742623"/>
+                    <pic:cNvPicPr/>
+                  </pic:nvPicPr>
+                  <pic:blipFill>
+                    <a:blip r:embed="rId9">
+                      <a:extLst>
+                        <a:ext uri="{28A0092B-C50C-407E-A947-70E740481C1C}">
+                          <a14:useLocalDpi xmlns:a14="http://schemas.microsoft.com/office/drawing/2010/main" val="0"/>
+                        </a:ext>
+                      </a:extLst>
+                    </a:blip>
+                    <a:stretch>
+                      <a:fillRect/>
+                    </a:stretch>
+                  </pic:blipFill>
+                  <pic:spPr>
+                    <a:xfrm>
+                      <a:off x="0" y="0"/>
+                      <a:ext cx="5943600" cy="5943600"/>
+                    </a:xfrm>
+                    <a:prstGeom prst="rect">
+                      <a:avLst/>
+                    </a:prstGeom>
+                  </pic:spPr>
+                </pic:pic>
+              </a:graphicData>
+            </a:graphic>
+          </wp:inline>
+        </w:drawing>
+      </w:r>
+      <w:r>
         <w:br w:type="page"/>
       </w:r>
     </w:p>
@@ -3334,12 +3440,6 @@
         <w:gridCol w:w="1730"/>
       </w:tblGrid>
       <w:tr>
-        <w:tblPrEx>
-          <w:tblCellMar>
-            <w:top w:w="0" w:type="dxa"/>
-            <w:bottom w:w="0" w:type="dxa"/>
-          </w:tblCellMar>
-        </w:tblPrEx>
         <w:trPr>
           <w:tblHeader/>
         </w:trPr>
@@ -3510,12 +3610,6 @@
         </w:tc>
       </w:tr>
       <w:tr>
-        <w:tblPrEx>
-          <w:tblCellMar>
-            <w:top w:w="0" w:type="dxa"/>
-            <w:bottom w:w="0" w:type="dxa"/>
-          </w:tblCellMar>
-        </w:tblPrEx>
         <w:tc>
           <w:tcPr>
             <w:tcW w:w="1400" w:type="dxa"/>
@@ -3701,12 +3795,6 @@
         </w:tc>
       </w:tr>
       <w:tr>
-        <w:tblPrEx>
-          <w:tblCellMar>
-            <w:top w:w="0" w:type="dxa"/>
-            <w:bottom w:w="0" w:type="dxa"/>
-          </w:tblCellMar>
-        </w:tblPrEx>
         <w:tc>
           <w:tcPr>
             <w:tcW w:w="1400" w:type="dxa"/>
@@ -3902,12 +3990,6 @@
         </w:tc>
       </w:tr>
       <w:tr>
-        <w:tblPrEx>
-          <w:tblCellMar>
-            <w:top w:w="0" w:type="dxa"/>
-            <w:bottom w:w="0" w:type="dxa"/>
-          </w:tblCellMar>
-        </w:tblPrEx>
         <w:tc>
           <w:tcPr>
             <w:tcW w:w="1400" w:type="dxa"/>
@@ -4085,12 +4167,6 @@
         </w:tc>
       </w:tr>
       <w:tr>
-        <w:tblPrEx>
-          <w:tblCellMar>
-            <w:top w:w="0" w:type="dxa"/>
-            <w:bottom w:w="0" w:type="dxa"/>
-          </w:tblCellMar>
-        </w:tblPrEx>
         <w:tc>
           <w:tcPr>
             <w:tcW w:w="1400" w:type="dxa"/>
@@ -4278,12 +4354,6 @@
         </w:tc>
       </w:tr>
       <w:tr>
-        <w:tblPrEx>
-          <w:tblCellMar>
-            <w:top w:w="0" w:type="dxa"/>
-            <w:bottom w:w="0" w:type="dxa"/>
-          </w:tblCellMar>
-        </w:tblPrEx>
         <w:tc>
           <w:tcPr>
             <w:tcW w:w="1400" w:type="dxa"/>
@@ -4479,12 +4549,6 @@
         </w:tc>
       </w:tr>
       <w:tr>
-        <w:tblPrEx>
-          <w:tblCellMar>
-            <w:top w:w="0" w:type="dxa"/>
-            <w:bottom w:w="0" w:type="dxa"/>
-          </w:tblCellMar>
-        </w:tblPrEx>
         <w:tc>
           <w:tcPr>
             <w:tcW w:w="1400" w:type="dxa"/>
@@ -4643,12 +4707,6 @@
         </w:tc>
       </w:tr>
       <w:tr>
-        <w:tblPrEx>
-          <w:tblCellMar>
-            <w:top w:w="0" w:type="dxa"/>
-            <w:bottom w:w="0" w:type="dxa"/>
-          </w:tblCellMar>
-        </w:tblPrEx>
         <w:tc>
           <w:tcPr>
             <w:tcW w:w="1400" w:type="dxa"/>
@@ -4816,12 +4874,6 @@
         </w:tc>
       </w:tr>
       <w:tr>
-        <w:tblPrEx>
-          <w:tblCellMar>
-            <w:top w:w="0" w:type="dxa"/>
-            <w:bottom w:w="0" w:type="dxa"/>
-          </w:tblCellMar>
-        </w:tblPrEx>
         <w:tc>
           <w:tcPr>
             <w:tcW w:w="1400" w:type="dxa"/>
@@ -4989,12 +5041,6 @@
         </w:tc>
       </w:tr>
       <w:tr>
-        <w:tblPrEx>
-          <w:tblCellMar>
-            <w:top w:w="0" w:type="dxa"/>
-            <w:bottom w:w="0" w:type="dxa"/>
-          </w:tblCellMar>
-        </w:tblPrEx>
         <w:tc>
           <w:tcPr>
             <w:tcW w:w="1400" w:type="dxa"/>
@@ -5162,12 +5208,6 @@
         </w:tc>
       </w:tr>
       <w:tr>
-        <w:tblPrEx>
-          <w:tblCellMar>
-            <w:top w:w="0" w:type="dxa"/>
-            <w:bottom w:w="0" w:type="dxa"/>
-          </w:tblCellMar>
-        </w:tblPrEx>
         <w:tc>
           <w:tcPr>
             <w:tcW w:w="1400" w:type="dxa"/>
@@ -5335,12 +5375,6 @@
         </w:tc>
       </w:tr>
       <w:tr>
-        <w:tblPrEx>
-          <w:tblCellMar>
-            <w:top w:w="0" w:type="dxa"/>
-            <w:bottom w:w="0" w:type="dxa"/>
-          </w:tblCellMar>
-        </w:tblPrEx>
         <w:tc>
           <w:tcPr>
             <w:tcW w:w="1400" w:type="dxa"/>
@@ -5516,12 +5550,6 @@
         </w:tc>
       </w:tr>
       <w:tr>
-        <w:tblPrEx>
-          <w:tblCellMar>
-            <w:top w:w="0" w:type="dxa"/>
-            <w:bottom w:w="0" w:type="dxa"/>
-          </w:tblCellMar>
-        </w:tblPrEx>
         <w:tc>
           <w:tcPr>
             <w:tcW w:w="1400" w:type="dxa"/>
@@ -5707,12 +5735,6 @@
         </w:tc>
       </w:tr>
       <w:tr>
-        <w:tblPrEx>
-          <w:tblCellMar>
-            <w:top w:w="0" w:type="dxa"/>
-            <w:bottom w:w="0" w:type="dxa"/>
-          </w:tblCellMar>
-        </w:tblPrEx>
         <w:tc>
           <w:tcPr>
             <w:tcW w:w="1400" w:type="dxa"/>
@@ -5880,12 +5902,6 @@
         </w:tc>
       </w:tr>
       <w:tr>
-        <w:tblPrEx>
-          <w:tblCellMar>
-            <w:top w:w="0" w:type="dxa"/>
-            <w:bottom w:w="0" w:type="dxa"/>
-          </w:tblCellMar>
-        </w:tblPrEx>
         <w:tc>
           <w:tcPr>
             <w:tcW w:w="1400" w:type="dxa"/>
@@ -6043,12 +6059,6 @@
         </w:tc>
       </w:tr>
       <w:tr>
-        <w:tblPrEx>
-          <w:tblCellMar>
-            <w:top w:w="0" w:type="dxa"/>
-            <w:bottom w:w="0" w:type="dxa"/>
-          </w:tblCellMar>
-        </w:tblPrEx>
         <w:tc>
           <w:tcPr>
             <w:tcW w:w="1400" w:type="dxa"/>
@@ -6216,12 +6226,6 @@
         </w:tc>
       </w:tr>
       <w:tr>
-        <w:tblPrEx>
-          <w:tblCellMar>
-            <w:top w:w="0" w:type="dxa"/>
-            <w:bottom w:w="0" w:type="dxa"/>
-          </w:tblCellMar>
-        </w:tblPrEx>
         <w:tc>
           <w:tcPr>
             <w:tcW w:w="1400" w:type="dxa"/>
@@ -6402,12 +6406,6 @@
         </w:tc>
       </w:tr>
       <w:tr>
-        <w:tblPrEx>
-          <w:tblCellMar>
-            <w:top w:w="0" w:type="dxa"/>
-            <w:bottom w:w="0" w:type="dxa"/>
-          </w:tblCellMar>
-        </w:tblPrEx>
         <w:tc>
           <w:tcPr>
             <w:tcW w:w="1400" w:type="dxa"/>
@@ -6595,12 +6593,6 @@
         </w:tc>
       </w:tr>
       <w:tr>
-        <w:tblPrEx>
-          <w:tblCellMar>
-            <w:top w:w="0" w:type="dxa"/>
-            <w:bottom w:w="0" w:type="dxa"/>
-          </w:tblCellMar>
-        </w:tblPrEx>
         <w:tc>
           <w:tcPr>
             <w:tcW w:w="1400" w:type="dxa"/>
@@ -6794,7 +6786,7 @@
                     </pic:cNvPicPr>
                   </pic:nvPicPr>
                   <pic:blipFill>
-                    <a:blip r:embed="rId9">
+                    <a:blip r:embed="rId10">
                       <a:extLst>
                         <a:ext uri="{28A0092B-C50C-407E-A947-70E740481C1C}">
                           <a14:useLocalDpi xmlns:a14="http://schemas.microsoft.com/office/drawing/2010/main" val="0"/>
@@ -6907,12 +6899,6 @@
         <w:gridCol w:w="1120"/>
       </w:tblGrid>
       <w:tr>
-        <w:tblPrEx>
-          <w:tblCellMar>
-            <w:top w:w="0" w:type="dxa"/>
-            <w:bottom w:w="0" w:type="dxa"/>
-          </w:tblCellMar>
-        </w:tblPrEx>
         <w:trPr>
           <w:tblHeader/>
         </w:trPr>
@@ -7182,12 +7168,6 @@
         </w:tc>
       </w:tr>
       <w:tr>
-        <w:tblPrEx>
-          <w:tblCellMar>
-            <w:top w:w="0" w:type="dxa"/>
-            <w:bottom w:w="0" w:type="dxa"/>
-          </w:tblCellMar>
-        </w:tblPrEx>
         <w:tc>
           <w:tcPr>
             <w:tcW w:w="2317" w:type="dxa"/>
@@ -7442,12 +7422,6 @@
         </w:tc>
       </w:tr>
       <w:tr>
-        <w:tblPrEx>
-          <w:tblCellMar>
-            <w:top w:w="0" w:type="dxa"/>
-            <w:bottom w:w="0" w:type="dxa"/>
-          </w:tblCellMar>
-        </w:tblPrEx>
         <w:tc>
           <w:tcPr>
             <w:tcW w:w="2317" w:type="dxa"/>
@@ -7720,12 +7694,6 @@
         </w:tc>
       </w:tr>
       <w:tr>
-        <w:tblPrEx>
-          <w:tblCellMar>
-            <w:top w:w="0" w:type="dxa"/>
-            <w:bottom w:w="0" w:type="dxa"/>
-          </w:tblCellMar>
-        </w:tblPrEx>
         <w:tc>
           <w:tcPr>
             <w:tcW w:w="2317" w:type="dxa"/>
@@ -7980,12 +7948,6 @@
         </w:tc>
       </w:tr>
       <w:tr>
-        <w:tblPrEx>
-          <w:tblCellMar>
-            <w:top w:w="0" w:type="dxa"/>
-            <w:bottom w:w="0" w:type="dxa"/>
-          </w:tblCellMar>
-        </w:tblPrEx>
         <w:tc>
           <w:tcPr>
             <w:tcW w:w="2317" w:type="dxa"/>
@@ -8240,12 +8202,6 @@
         </w:tc>
       </w:tr>
       <w:tr>
-        <w:tblPrEx>
-          <w:tblCellMar>
-            <w:top w:w="0" w:type="dxa"/>
-            <w:bottom w:w="0" w:type="dxa"/>
-          </w:tblCellMar>
-        </w:tblPrEx>
         <w:tc>
           <w:tcPr>
             <w:tcW w:w="2317" w:type="dxa"/>
@@ -8518,12 +8474,6 @@
         </w:tc>
       </w:tr>
       <w:tr>
-        <w:tblPrEx>
-          <w:tblCellMar>
-            <w:top w:w="0" w:type="dxa"/>
-            <w:bottom w:w="0" w:type="dxa"/>
-          </w:tblCellMar>
-        </w:tblPrEx>
         <w:tc>
           <w:tcPr>
             <w:tcW w:w="2317" w:type="dxa"/>
@@ -8778,12 +8728,6 @@
         </w:tc>
       </w:tr>
       <w:tr>
-        <w:tblPrEx>
-          <w:tblCellMar>
-            <w:top w:w="0" w:type="dxa"/>
-            <w:bottom w:w="0" w:type="dxa"/>
-          </w:tblCellMar>
-        </w:tblPrEx>
         <w:tc>
           <w:tcPr>
             <w:tcW w:w="2317" w:type="dxa"/>
@@ -9038,12 +8982,6 @@
         </w:tc>
       </w:tr>
       <w:tr>
-        <w:tblPrEx>
-          <w:tblCellMar>
-            <w:top w:w="0" w:type="dxa"/>
-            <w:bottom w:w="0" w:type="dxa"/>
-          </w:tblCellMar>
-        </w:tblPrEx>
         <w:tc>
           <w:tcPr>
             <w:tcW w:w="2317" w:type="dxa"/>
@@ -9298,12 +9236,6 @@
         </w:tc>
       </w:tr>
       <w:tr>
-        <w:tblPrEx>
-          <w:tblCellMar>
-            <w:top w:w="0" w:type="dxa"/>
-            <w:bottom w:w="0" w:type="dxa"/>
-          </w:tblCellMar>
-        </w:tblPrEx>
         <w:tc>
           <w:tcPr>
             <w:tcW w:w="2317" w:type="dxa"/>
@@ -9558,12 +9490,6 @@
         </w:tc>
       </w:tr>
       <w:tr>
-        <w:tblPrEx>
-          <w:tblCellMar>
-            <w:top w:w="0" w:type="dxa"/>
-            <w:bottom w:w="0" w:type="dxa"/>
-          </w:tblCellMar>
-        </w:tblPrEx>
         <w:tc>
           <w:tcPr>
             <w:tcW w:w="2317" w:type="dxa"/>
@@ -9818,12 +9744,6 @@
         </w:tc>
       </w:tr>
       <w:tr>
-        <w:tblPrEx>
-          <w:tblCellMar>
-            <w:top w:w="0" w:type="dxa"/>
-            <w:bottom w:w="0" w:type="dxa"/>
-          </w:tblCellMar>
-        </w:tblPrEx>
         <w:tc>
           <w:tcPr>
             <w:tcW w:w="2317" w:type="dxa"/>
@@ -10088,12 +10008,6 @@
         </w:tc>
       </w:tr>
       <w:tr>
-        <w:tblPrEx>
-          <w:tblCellMar>
-            <w:top w:w="0" w:type="dxa"/>
-            <w:bottom w:w="0" w:type="dxa"/>
-          </w:tblCellMar>
-        </w:tblPrEx>
         <w:tc>
           <w:tcPr>
             <w:tcW w:w="2317" w:type="dxa"/>
@@ -10348,12 +10262,6 @@
         </w:tc>
       </w:tr>
       <w:tr>
-        <w:tblPrEx>
-          <w:tblCellMar>
-            <w:top w:w="0" w:type="dxa"/>
-            <w:bottom w:w="0" w:type="dxa"/>
-          </w:tblCellMar>
-        </w:tblPrEx>
         <w:tc>
           <w:tcPr>
             <w:tcW w:w="2317" w:type="dxa"/>
@@ -10608,12 +10516,6 @@
         </w:tc>
       </w:tr>
       <w:tr>
-        <w:tblPrEx>
-          <w:tblCellMar>
-            <w:top w:w="0" w:type="dxa"/>
-            <w:bottom w:w="0" w:type="dxa"/>
-          </w:tblCellMar>
-        </w:tblPrEx>
         <w:tc>
           <w:tcPr>
             <w:tcW w:w="2317" w:type="dxa"/>
@@ -10869,12 +10771,6 @@
         </w:tc>
       </w:tr>
       <w:tr>
-        <w:tblPrEx>
-          <w:tblCellMar>
-            <w:top w:w="0" w:type="dxa"/>
-            <w:bottom w:w="0" w:type="dxa"/>
-          </w:tblCellMar>
-        </w:tblPrEx>
         <w:tc>
           <w:tcPr>
             <w:tcW w:w="2317" w:type="dxa"/>
@@ -11129,12 +11025,6 @@
         </w:tc>
       </w:tr>
       <w:tr>
-        <w:tblPrEx>
-          <w:tblCellMar>
-            <w:top w:w="0" w:type="dxa"/>
-            <w:bottom w:w="0" w:type="dxa"/>
-          </w:tblCellMar>
-        </w:tblPrEx>
         <w:tc>
           <w:tcPr>
             <w:tcW w:w="2317" w:type="dxa"/>
@@ -11389,12 +11279,6 @@
         </w:tc>
       </w:tr>
       <w:tr>
-        <w:tblPrEx>
-          <w:tblCellMar>
-            <w:top w:w="0" w:type="dxa"/>
-            <w:bottom w:w="0" w:type="dxa"/>
-          </w:tblCellMar>
-        </w:tblPrEx>
         <w:tc>
           <w:tcPr>
             <w:tcW w:w="2317" w:type="dxa"/>
@@ -11667,12 +11551,6 @@
         </w:tc>
       </w:tr>
       <w:tr>
-        <w:tblPrEx>
-          <w:tblCellMar>
-            <w:top w:w="0" w:type="dxa"/>
-            <w:bottom w:w="0" w:type="dxa"/>
-          </w:tblCellMar>
-        </w:tblPrEx>
         <w:tc>
           <w:tcPr>
             <w:tcW w:w="2317" w:type="dxa"/>
@@ -11927,12 +11805,6 @@
         </w:tc>
       </w:tr>
       <w:tr>
-        <w:tblPrEx>
-          <w:tblCellMar>
-            <w:top w:w="0" w:type="dxa"/>
-            <w:bottom w:w="0" w:type="dxa"/>
-          </w:tblCellMar>
-        </w:tblPrEx>
         <w:tc>
           <w:tcPr>
             <w:tcW w:w="2317" w:type="dxa"/>
@@ -12197,12 +12069,6 @@
         </w:tc>
       </w:tr>
       <w:tr>
-        <w:tblPrEx>
-          <w:tblCellMar>
-            <w:top w:w="0" w:type="dxa"/>
-            <w:bottom w:w="0" w:type="dxa"/>
-          </w:tblCellMar>
-        </w:tblPrEx>
         <w:tc>
           <w:tcPr>
             <w:tcW w:w="2317" w:type="dxa"/>
@@ -12457,12 +12323,6 @@
         </w:tc>
       </w:tr>
       <w:tr>
-        <w:tblPrEx>
-          <w:tblCellMar>
-            <w:top w:w="0" w:type="dxa"/>
-            <w:bottom w:w="0" w:type="dxa"/>
-          </w:tblCellMar>
-        </w:tblPrEx>
         <w:tc>
           <w:tcPr>
             <w:tcW w:w="2317" w:type="dxa"/>
@@ -12717,12 +12577,6 @@
         </w:tc>
       </w:tr>
       <w:tr>
-        <w:tblPrEx>
-          <w:tblCellMar>
-            <w:top w:w="0" w:type="dxa"/>
-            <w:bottom w:w="0" w:type="dxa"/>
-          </w:tblCellMar>
-        </w:tblPrEx>
         <w:tc>
           <w:tcPr>
             <w:tcW w:w="2317" w:type="dxa"/>
@@ -13019,7 +12873,7 @@
                     </pic:cNvPicPr>
                   </pic:nvPicPr>
                   <pic:blipFill>
-                    <a:blip r:embed="rId10">
+                    <a:blip r:embed="rId11">
                       <a:extLst>
                         <a:ext uri="{28A0092B-C50C-407E-A947-70E740481C1C}">
                           <a14:useLocalDpi xmlns:a14="http://schemas.microsoft.com/office/drawing/2010/main" val="0"/>
@@ -15099,7 +14953,7 @@
                     </pic:cNvPicPr>
                   </pic:nvPicPr>
                   <pic:blipFill>
-                    <a:blip r:embed="rId11">
+                    <a:blip r:embed="rId12">
                       <a:extLst>
                         <a:ext uri="{28A0092B-C50C-407E-A947-70E740481C1C}">
                           <a14:useLocalDpi xmlns:a14="http://schemas.microsoft.com/office/drawing/2010/main" val="0"/>
@@ -15185,12 +15039,6 @@
         <w:gridCol w:w="2519"/>
       </w:tblGrid>
       <w:tr>
-        <w:tblPrEx>
-          <w:tblCellMar>
-            <w:top w:w="0" w:type="dxa"/>
-            <w:bottom w:w="0" w:type="dxa"/>
-          </w:tblCellMar>
-        </w:tblPrEx>
         <w:trPr>
           <w:trHeight w:val="550"/>
           <w:tblHeader/>
@@ -15362,12 +15210,6 @@
         </w:tc>
       </w:tr>
       <w:tr>
-        <w:tblPrEx>
-          <w:tblCellMar>
-            <w:top w:w="0" w:type="dxa"/>
-            <w:bottom w:w="0" w:type="dxa"/>
-          </w:tblCellMar>
-        </w:tblPrEx>
         <w:trPr>
           <w:trHeight w:val="1025"/>
         </w:trPr>
@@ -15566,12 +15408,6 @@
         </w:tc>
       </w:tr>
       <w:tr>
-        <w:tblPrEx>
-          <w:tblCellMar>
-            <w:top w:w="0" w:type="dxa"/>
-            <w:bottom w:w="0" w:type="dxa"/>
-          </w:tblCellMar>
-        </w:tblPrEx>
         <w:trPr>
           <w:trHeight w:val="1025"/>
         </w:trPr>
@@ -15852,12 +15688,6 @@
         </w:tc>
       </w:tr>
       <w:tr>
-        <w:tblPrEx>
-          <w:tblCellMar>
-            <w:top w:w="0" w:type="dxa"/>
-            <w:bottom w:w="0" w:type="dxa"/>
-          </w:tblCellMar>
-        </w:tblPrEx>
         <w:trPr>
           <w:trHeight w:val="1239"/>
         </w:trPr>
@@ -16048,12 +15878,6 @@
         </w:tc>
       </w:tr>
       <w:tr>
-        <w:tblPrEx>
-          <w:tblCellMar>
-            <w:top w:w="0" w:type="dxa"/>
-            <w:bottom w:w="0" w:type="dxa"/>
-          </w:tblCellMar>
-        </w:tblPrEx>
         <w:trPr>
           <w:trHeight w:val="795"/>
         </w:trPr>
@@ -16270,12 +16094,6 @@
         </w:tc>
       </w:tr>
       <w:tr>
-        <w:tblPrEx>
-          <w:tblCellMar>
-            <w:top w:w="0" w:type="dxa"/>
-            <w:bottom w:w="0" w:type="dxa"/>
-          </w:tblCellMar>
-        </w:tblPrEx>
         <w:trPr>
           <w:trHeight w:val="1254"/>
         </w:trPr>
@@ -16466,12 +16284,6 @@
         </w:tc>
       </w:tr>
       <w:tr>
-        <w:tblPrEx>
-          <w:tblCellMar>
-            <w:top w:w="0" w:type="dxa"/>
-            <w:bottom w:w="0" w:type="dxa"/>
-          </w:tblCellMar>
-        </w:tblPrEx>
         <w:trPr>
           <w:trHeight w:val="1009"/>
         </w:trPr>
@@ -16690,12 +16502,6 @@
         </w:tc>
       </w:tr>
       <w:tr>
-        <w:tblPrEx>
-          <w:tblCellMar>
-            <w:top w:w="0" w:type="dxa"/>
-            <w:bottom w:w="0" w:type="dxa"/>
-          </w:tblCellMar>
-        </w:tblPrEx>
         <w:trPr>
           <w:trHeight w:val="1025"/>
         </w:trPr>
@@ -16904,12 +16710,6 @@
         </w:tc>
       </w:tr>
       <w:tr>
-        <w:tblPrEx>
-          <w:tblCellMar>
-            <w:top w:w="0" w:type="dxa"/>
-            <w:bottom w:w="0" w:type="dxa"/>
-          </w:tblCellMar>
-        </w:tblPrEx>
         <w:trPr>
           <w:trHeight w:val="1483"/>
         </w:trPr>
@@ -17157,12 +16957,6 @@
         </w:tc>
       </w:tr>
       <w:tr>
-        <w:tblPrEx>
-          <w:tblCellMar>
-            <w:top w:w="0" w:type="dxa"/>
-            <w:bottom w:w="0" w:type="dxa"/>
-          </w:tblCellMar>
-        </w:tblPrEx>
         <w:trPr>
           <w:trHeight w:val="1025"/>
         </w:trPr>
@@ -17343,12 +17137,6 @@
         </w:tc>
       </w:tr>
       <w:tr>
-        <w:tblPrEx>
-          <w:tblCellMar>
-            <w:top w:w="0" w:type="dxa"/>
-            <w:bottom w:w="0" w:type="dxa"/>
-          </w:tblCellMar>
-        </w:tblPrEx>
         <w:trPr>
           <w:trHeight w:val="1009"/>
         </w:trPr>
@@ -17511,12 +17299,6 @@
         </w:tc>
       </w:tr>
       <w:tr>
-        <w:tblPrEx>
-          <w:tblCellMar>
-            <w:top w:w="0" w:type="dxa"/>
-            <w:bottom w:w="0" w:type="dxa"/>
-          </w:tblCellMar>
-        </w:tblPrEx>
         <w:trPr>
           <w:trHeight w:val="1254"/>
         </w:trPr>
@@ -17727,12 +17509,6 @@
         </w:tc>
       </w:tr>
       <w:tr>
-        <w:tblPrEx>
-          <w:tblCellMar>
-            <w:top w:w="0" w:type="dxa"/>
-            <w:bottom w:w="0" w:type="dxa"/>
-          </w:tblCellMar>
-        </w:tblPrEx>
         <w:trPr>
           <w:trHeight w:val="1483"/>
         </w:trPr>
@@ -17967,12 +17743,6 @@
         </w:tc>
       </w:tr>
       <w:tr>
-        <w:tblPrEx>
-          <w:tblCellMar>
-            <w:top w:w="0" w:type="dxa"/>
-            <w:bottom w:w="0" w:type="dxa"/>
-          </w:tblCellMar>
-        </w:tblPrEx>
         <w:trPr>
           <w:trHeight w:val="1483"/>
         </w:trPr>
@@ -18209,12 +17979,6 @@
         </w:tc>
       </w:tr>
       <w:tr>
-        <w:tblPrEx>
-          <w:tblCellMar>
-            <w:top w:w="0" w:type="dxa"/>
-            <w:bottom w:w="0" w:type="dxa"/>
-          </w:tblCellMar>
-        </w:tblPrEx>
         <w:trPr>
           <w:trHeight w:val="1025"/>
         </w:trPr>
@@ -20456,12 +20220,6 @@
         <w:gridCol w:w="3960"/>
       </w:tblGrid>
       <w:tr>
-        <w:tblPrEx>
-          <w:tblCellMar>
-            <w:top w:w="0" w:type="dxa"/>
-            <w:bottom w:w="0" w:type="dxa"/>
-          </w:tblCellMar>
-        </w:tblPrEx>
         <w:trPr>
           <w:tblHeader/>
         </w:trPr>
@@ -20566,12 +20324,6 @@
         </w:tc>
       </w:tr>
       <w:tr>
-        <w:tblPrEx>
-          <w:tblCellMar>
-            <w:top w:w="0" w:type="dxa"/>
-            <w:bottom w:w="0" w:type="dxa"/>
-          </w:tblCellMar>
-        </w:tblPrEx>
         <w:tc>
           <w:tcPr>
             <w:tcW w:w="1800" w:type="dxa"/>
@@ -20669,12 +20421,6 @@
         </w:tc>
       </w:tr>
       <w:tr>
-        <w:tblPrEx>
-          <w:tblCellMar>
-            <w:top w:w="0" w:type="dxa"/>
-            <w:bottom w:w="0" w:type="dxa"/>
-          </w:tblCellMar>
-        </w:tblPrEx>
         <w:tc>
           <w:tcPr>
             <w:tcW w:w="1800" w:type="dxa"/>
@@ -20818,12 +20564,6 @@
         </w:tc>
       </w:tr>
       <w:tr>
-        <w:tblPrEx>
-          <w:tblCellMar>
-            <w:top w:w="0" w:type="dxa"/>
-            <w:bottom w:w="0" w:type="dxa"/>
-          </w:tblCellMar>
-        </w:tblPrEx>
         <w:tc>
           <w:tcPr>
             <w:tcW w:w="1800" w:type="dxa"/>
@@ -20987,12 +20727,6 @@
         </w:tc>
       </w:tr>
       <w:tr>
-        <w:tblPrEx>
-          <w:tblCellMar>
-            <w:top w:w="0" w:type="dxa"/>
-            <w:bottom w:w="0" w:type="dxa"/>
-          </w:tblCellMar>
-        </w:tblPrEx>
         <w:tc>
           <w:tcPr>
             <w:tcW w:w="1800" w:type="dxa"/>
@@ -21118,12 +20852,6 @@
         </w:tc>
       </w:tr>
       <w:tr>
-        <w:tblPrEx>
-          <w:tblCellMar>
-            <w:top w:w="0" w:type="dxa"/>
-            <w:bottom w:w="0" w:type="dxa"/>
-          </w:tblCellMar>
-        </w:tblPrEx>
         <w:tc>
           <w:tcPr>
             <w:tcW w:w="1800" w:type="dxa"/>
@@ -21221,12 +20949,6 @@
         </w:tc>
       </w:tr>
       <w:tr>
-        <w:tblPrEx>
-          <w:tblCellMar>
-            <w:top w:w="0" w:type="dxa"/>
-            <w:bottom w:w="0" w:type="dxa"/>
-          </w:tblCellMar>
-        </w:tblPrEx>
         <w:tc>
           <w:tcPr>
             <w:tcW w:w="1800" w:type="dxa"/>
@@ -21324,12 +21046,6 @@
         </w:tc>
       </w:tr>
       <w:tr>
-        <w:tblPrEx>
-          <w:tblCellMar>
-            <w:top w:w="0" w:type="dxa"/>
-            <w:bottom w:w="0" w:type="dxa"/>
-          </w:tblCellMar>
-        </w:tblPrEx>
         <w:tc>
           <w:tcPr>
             <w:tcW w:w="1800" w:type="dxa"/>
@@ -21437,12 +21153,6 @@
         </w:tc>
       </w:tr>
       <w:tr>
-        <w:tblPrEx>
-          <w:tblCellMar>
-            <w:top w:w="0" w:type="dxa"/>
-            <w:bottom w:w="0" w:type="dxa"/>
-          </w:tblCellMar>
-        </w:tblPrEx>
         <w:tc>
           <w:tcPr>
             <w:tcW w:w="1800" w:type="dxa"/>
@@ -21542,12 +21252,6 @@
         </w:tc>
       </w:tr>
       <w:tr>
-        <w:tblPrEx>
-          <w:tblCellMar>
-            <w:top w:w="0" w:type="dxa"/>
-            <w:bottom w:w="0" w:type="dxa"/>
-          </w:tblCellMar>
-        </w:tblPrEx>
         <w:tc>
           <w:tcPr>
             <w:tcW w:w="1800" w:type="dxa"/>
@@ -21677,12 +21381,6 @@
         </w:tc>
       </w:tr>
       <w:tr>
-        <w:tblPrEx>
-          <w:tblCellMar>
-            <w:top w:w="0" w:type="dxa"/>
-            <w:bottom w:w="0" w:type="dxa"/>
-          </w:tblCellMar>
-        </w:tblPrEx>
         <w:tc>
           <w:tcPr>
             <w:tcW w:w="1800" w:type="dxa"/>
@@ -21790,12 +21488,6 @@
         </w:tc>
       </w:tr>
       <w:tr>
-        <w:tblPrEx>
-          <w:tblCellMar>
-            <w:top w:w="0" w:type="dxa"/>
-            <w:bottom w:w="0" w:type="dxa"/>
-          </w:tblCellMar>
-        </w:tblPrEx>
         <w:tc>
           <w:tcPr>
             <w:tcW w:w="1800" w:type="dxa"/>
@@ -21911,12 +21603,6 @@
         </w:tc>
       </w:tr>
       <w:tr>
-        <w:tblPrEx>
-          <w:tblCellMar>
-            <w:top w:w="0" w:type="dxa"/>
-            <w:bottom w:w="0" w:type="dxa"/>
-          </w:tblCellMar>
-        </w:tblPrEx>
         <w:tc>
           <w:tcPr>
             <w:tcW w:w="1800" w:type="dxa"/>
@@ -22032,12 +21718,6 @@
         </w:tc>
       </w:tr>
       <w:tr>
-        <w:tblPrEx>
-          <w:tblCellMar>
-            <w:top w:w="0" w:type="dxa"/>
-            <w:bottom w:w="0" w:type="dxa"/>
-          </w:tblCellMar>
-        </w:tblPrEx>
         <w:tc>
           <w:tcPr>
             <w:tcW w:w="1800" w:type="dxa"/>
@@ -22154,12 +21834,6 @@
         </w:tc>
       </w:tr>
       <w:tr>
-        <w:tblPrEx>
-          <w:tblCellMar>
-            <w:top w:w="0" w:type="dxa"/>
-            <w:bottom w:w="0" w:type="dxa"/>
-          </w:tblCellMar>
-        </w:tblPrEx>
         <w:tc>
           <w:tcPr>
             <w:tcW w:w="1800" w:type="dxa"/>
@@ -22293,12 +21967,6 @@
         </w:tc>
       </w:tr>
       <w:tr>
-        <w:tblPrEx>
-          <w:tblCellMar>
-            <w:top w:w="0" w:type="dxa"/>
-            <w:bottom w:w="0" w:type="dxa"/>
-          </w:tblCellMar>
-        </w:tblPrEx>
         <w:tc>
           <w:tcPr>
             <w:tcW w:w="1800" w:type="dxa"/>
@@ -22437,7 +22105,7 @@
                     </pic:cNvPicPr>
                   </pic:nvPicPr>
                   <pic:blipFill>
-                    <a:blip r:embed="rId12">
+                    <a:blip r:embed="rId13">
                       <a:extLst>
                         <a:ext uri="{28A0092B-C50C-407E-A947-70E740481C1C}">
                           <a14:useLocalDpi xmlns:a14="http://schemas.microsoft.com/office/drawing/2010/main" val="0"/>
@@ -23628,8 +23296,8 @@
       </w:r>
     </w:p>
     <w:sectPr>
-      <w:headerReference w:type="default" r:id="rId13"/>
-      <w:footerReference w:type="default" r:id="rId14"/>
+      <w:headerReference w:type="default" r:id="rId14"/>
+      <w:footerReference w:type="default" r:id="rId15"/>
       <w:pgSz w:w="12240" w:h="15840"/>
       <w:pgMar w:top="1440" w:right="1440" w:bottom="1440" w:left="1440" w:header="708" w:footer="708" w:gutter="0"/>
       <w:cols w:space="720"/>

</xml_diff>